<commit_message>
Wire legal pages into the landing site; fill in contact details
- landing/privacy.html + landing/terms.html: web versions of the v2
  Privacy Policy and Terms of Use, styled to match the landing
- footer: Legal links wired (privacy, terms, cookies anchor), Support
  now mails support@zitch.ng, contact block added (Ketu Lagos,
  support@zitch.ng, 08166938327, Instagram @zitchng)
- footer compliance fix: replace 'Licensed by the CBN. Deposits
  insured by the NDIC.' with partner-institution wording so the
  public claim matches the Terms' regulatory-status clause
- regenerate the two Word masters at the repo root with the real
  contact details (replacing bracketed placeholders)

https://claude.ai/code/session_016PQDPGgSL6o8d9auGuXtf6
</commit_message>
<xml_diff>
--- a/ZITCH_TECHNOLOGIES_PRIVACY_POLICY_v2.docx
+++ b/ZITCH_TECHNOLOGIES_PRIVACY_POLICY_v2.docx
@@ -89,7 +89,7 @@
           <w:b w:val="0"/>
           <w:i w:val="0"/>
         </w:rPr>
-        <w:t>”) explains how Zitch Technologies Limited (RC [insert RC number]) of 41, Awoniyi Elemo Street, Lagos State, Nigeria (“</w:t>
+        <w:t>”) explains how Zitch Technologies Limited (RC [insert RC number]) of Ketu, Lagos State, Nigeria (“</w:t>
       </w:r>
       <w:r>
         <w:rPr>
@@ -1604,7 +1604,7 @@
           <w:b w:val="0"/>
           <w:i w:val="0"/>
         </w:rPr>
-        <w:t xml:space="preserve"> 41, Awoniyi Elemo Street, Lagos State, Nigeria</w:t>
+        <w:t xml:space="preserve"> Ketu, Lagos State, Nigeria</w:t>
       </w:r>
       <w:r>
         <w:br/>
@@ -1614,7 +1614,7 @@
           <w:b w:val="0"/>
           <w:i w:val="0"/>
         </w:rPr>
-        <w:t xml:space="preserve"> Email: [insert DPO email, e.g. dpo@zitch.ng]</w:t>
+        <w:t xml:space="preserve"> Email: support@zitch.ng (mark your message “Attention: DPO”)</w:t>
       </w:r>
       <w:r>
         <w:br/>
@@ -1624,7 +1624,7 @@
           <w:b w:val="0"/>
           <w:i w:val="0"/>
         </w:rPr>
-        <w:t xml:space="preserve"> Phone: [insert phone number]</w:t>
+        <w:t xml:space="preserve"> Phone: 08166938327</w:t>
       </w:r>
     </w:p>
     <w:p>

</xml_diff>